<commit_message>
Mise à jour de l'application : ajout du support multi-module (HAM/SAM), intégration des explications pédagogiques, et corrections de la structure JSON
</commit_message>
<xml_diff>
--- a/SAM_QandR.docx
+++ b/SAM_QandR.docx
@@ -5587,33 +5587,10 @@
           <w:rFonts w:ascii="Cambria" w:hAnsi="Cambria"/>
           <w:lang w:val="en-US"/>
         </w:rPr>
-        <w:t> </w:t>
-      </w:r>
-      <w:r>
-        <w:rPr>
-          <w:rFonts w:ascii="Cambria" w:hAnsi="Cambria"/>
-          <w:lang w:val="en-US"/>
-        </w:rPr>
-        <w:t>AB</w:t>
-      </w:r>
-      <w:r>
-        <w:rPr>
-          <w:rFonts w:ascii="Cambria" w:hAnsi="Cambria"/>
-          <w:i/>
-          <w:iCs/>
-          <w:lang w:val="en-US"/>
-        </w:rPr>
-        <w:t>C</w:t>
-      </w:r>
-      <w:r>
-        <w:rPr>
-          <w:rFonts w:ascii="Cambria" w:hAnsi="Cambria"/>
-          <w:i/>
-          <w:iCs/>
-          <w:lang w:val="en-US"/>
-        </w:rPr>
-        <w:t>D</w:t>
-      </w:r>
+        <w:t xml:space="preserve"> C</w:t>
+      </w:r>
+      <w:bookmarkStart w:id="0" w:name="_GoBack"/>
+      <w:bookmarkEnd w:id="0"/>
     </w:p>
     <w:p>
       <w:pPr>
@@ -21716,8 +21693,6 @@
           <w:lang w:val="en-US"/>
         </w:rPr>
       </w:pPr>
-      <w:bookmarkStart w:id="0" w:name="_GoBack"/>
-      <w:bookmarkEnd w:id="0"/>
     </w:p>
     <w:p>
       <w:pPr>

</xml_diff>